<commit_message>
feat: aprimorar RTP e validações de relatórios de serviço
  - adiciona seleção do equipamento testado no formulário de RTP
  - ajusta campos e validações para tubulação, mangueiras e outro
  - preenche o placeholder {{EQUIPMENTTYPE}} no RTP
  - remove a tabela de medidas do RTP quando Outro não possui diâmetros/comprimentos
  - permite editar relatórios de serviço na mesma data sem bloqueio por duplicidade
  - atualiza testes e mapa do modelo RTP
</commit_message>
<xml_diff>
--- a/Modelos/definitivos/Modelo - RTP.docx
+++ b/Modelos/definitivos/Modelo - RTP.docx
@@ -114,25 +114,7 @@
                 <w:sz w:val="18"/>
                 <w:szCs w:val="18"/>
               </w:rPr>
-              <w:t>{{</w:t>
-            </w:r>
-            <w:proofErr w:type="spellStart"/>
-            <w:r>
-              <w:rPr>
-                <w:color w:val="11437E"/>
-                <w:sz w:val="18"/>
-                <w:szCs w:val="18"/>
-              </w:rPr>
-              <w:t>equipament</w:t>
-            </w:r>
-            <w:proofErr w:type="spellEnd"/>
-            <w:r>
-              <w:rPr>
-                <w:color w:val="11437E"/>
-                <w:sz w:val="18"/>
-                <w:szCs w:val="18"/>
-              </w:rPr>
-              <w:t>}}</w:t>
+              <w:t>{{equipament}}</w:t>
             </w:r>
           </w:p>
         </w:tc>
@@ -191,7 +173,6 @@
               </w:rPr>
               <w:t>{{</w:t>
             </w:r>
-            <w:proofErr w:type="spellStart"/>
             <w:r>
               <w:rPr>
                 <w:color w:val="11437E"/>
@@ -200,7 +181,6 @@
               </w:rPr>
               <w:t>fluid</w:t>
             </w:r>
-            <w:proofErr w:type="spellEnd"/>
             <w:r>
               <w:rPr>
                 <w:color w:val="11437E"/>
@@ -257,7 +237,6 @@
               </w:rPr>
               <w:t>{{</w:t>
             </w:r>
-            <w:proofErr w:type="spellStart"/>
             <w:r>
               <w:rPr>
                 <w:color w:val="11437E"/>
@@ -266,7 +245,6 @@
               </w:rPr>
               <w:t>projectpressure</w:t>
             </w:r>
-            <w:proofErr w:type="spellEnd"/>
             <w:r>
               <w:rPr>
                 <w:color w:val="11437E"/>
@@ -333,7 +311,6 @@
               </w:rPr>
               <w:t>{{</w:t>
             </w:r>
-            <w:proofErr w:type="spellStart"/>
             <w:r>
               <w:rPr>
                 <w:color w:val="11437E"/>
@@ -342,7 +319,6 @@
               </w:rPr>
               <w:t>testpressure</w:t>
             </w:r>
-            <w:proofErr w:type="spellEnd"/>
             <w:r>
               <w:rPr>
                 <w:color w:val="11437E"/>
@@ -443,7 +419,6 @@
               </w:rPr>
               <w:t>{{</w:t>
             </w:r>
-            <w:proofErr w:type="spellStart"/>
             <w:r>
               <w:rPr>
                 <w:color w:val="11437E"/>
@@ -452,7 +427,6 @@
               </w:rPr>
               <w:t>testunit</w:t>
             </w:r>
-            <w:proofErr w:type="spellEnd"/>
             <w:r>
               <w:rPr>
                 <w:color w:val="11437E"/>
@@ -509,23 +483,13 @@
               </w:rPr>
               <w:t>{{</w:t>
             </w:r>
-            <w:proofErr w:type="spellStart"/>
-            <w:r>
-              <w:rPr>
-                <w:color w:val="11437E"/>
-                <w:sz w:val="18"/>
-                <w:szCs w:val="18"/>
-              </w:rPr>
-              <w:t>starttime</w:t>
-            </w:r>
-            <w:proofErr w:type="spellEnd"/>
-            <w:r>
-              <w:rPr>
-                <w:color w:val="11437E"/>
-                <w:sz w:val="18"/>
-                <w:szCs w:val="18"/>
-              </w:rPr>
-              <w:t>}</w:t>
+            <w:r>
+              <w:rPr>
+                <w:color w:val="11437E"/>
+                <w:sz w:val="18"/>
+                <w:szCs w:val="18"/>
+              </w:rPr>
+              <w:t>starttime}</w:t>
             </w:r>
             <w:r>
               <w:rPr>
@@ -595,7 +559,6 @@
               </w:rPr>
               <w:t>{{</w:t>
             </w:r>
-            <w:proofErr w:type="spellStart"/>
             <w:r>
               <w:rPr>
                 <w:color w:val="11437E"/>
@@ -604,7 +567,6 @@
               </w:rPr>
               <w:t>endtime</w:t>
             </w:r>
-            <w:proofErr w:type="spellEnd"/>
             <w:r>
               <w:rPr>
                 <w:color w:val="11437E"/>
@@ -645,51 +607,22 @@
                 <w:szCs w:val="18"/>
               </w:rPr>
             </w:pPr>
-            <w:proofErr w:type="spellStart"/>
-            <w:r>
-              <w:rPr>
-                <w:b/>
-                <w:bCs/>
-                <w:sz w:val="18"/>
-                <w:szCs w:val="18"/>
-              </w:rPr>
-              <w:t>Tags</w:t>
-            </w:r>
-            <w:proofErr w:type="spellEnd"/>
-            <w:r>
-              <w:rPr>
-                <w:b/>
-                <w:bCs/>
-                <w:sz w:val="18"/>
-                <w:szCs w:val="18"/>
-              </w:rPr>
-              <w:t xml:space="preserve">: </w:t>
-            </w:r>
-            <w:r>
-              <w:rPr>
-                <w:color w:val="11437E"/>
-                <w:sz w:val="18"/>
-                <w:szCs w:val="18"/>
-              </w:rPr>
-              <w:t>{{</w:t>
-            </w:r>
-            <w:proofErr w:type="spellStart"/>
-            <w:r>
-              <w:rPr>
-                <w:color w:val="11437E"/>
-                <w:sz w:val="18"/>
-                <w:szCs w:val="18"/>
-              </w:rPr>
-              <w:t>tags</w:t>
-            </w:r>
-            <w:proofErr w:type="spellEnd"/>
-            <w:r>
-              <w:rPr>
-                <w:color w:val="11437E"/>
-                <w:sz w:val="18"/>
-                <w:szCs w:val="18"/>
-              </w:rPr>
-              <w:t>}}</w:t>
+            <w:r>
+              <w:rPr>
+                <w:b/>
+                <w:bCs/>
+                <w:sz w:val="18"/>
+                <w:szCs w:val="18"/>
+              </w:rPr>
+              <w:t xml:space="preserve">Tags: </w:t>
+            </w:r>
+            <w:r>
+              <w:rPr>
+                <w:color w:val="11437E"/>
+                <w:sz w:val="18"/>
+                <w:szCs w:val="18"/>
+              </w:rPr>
+              <w:t>{{tags}}</w:t>
             </w:r>
           </w:p>
         </w:tc>
@@ -740,7 +673,6 @@
               </w:rPr>
               <w:t>{{</w:t>
             </w:r>
-            <w:proofErr w:type="spellStart"/>
             <w:r>
               <w:rPr>
                 <w:color w:val="11437E"/>
@@ -749,7 +681,6 @@
               </w:rPr>
               <w:t>rtp</w:t>
             </w:r>
-            <w:proofErr w:type="spellEnd"/>
             <w:r>
               <w:rPr>
                 <w:color w:val="11437E"/>
@@ -807,7 +738,7 @@
                 <w:sz w:val="18"/>
                 <w:szCs w:val="18"/>
               </w:rPr>
-              <w:t>TUBULAÇ</w:t>
+              <w:t>{{</w:t>
             </w:r>
             <w:r>
               <w:rPr>
@@ -817,7 +748,7 @@
                 <w:sz w:val="18"/>
                 <w:szCs w:val="18"/>
               </w:rPr>
-              <w:t>Õ</w:t>
+              <w:t>EQUIPMENTTYPE</w:t>
             </w:r>
             <w:r>
               <w:rPr>
@@ -827,7 +758,7 @@
                 <w:sz w:val="18"/>
                 <w:szCs w:val="18"/>
               </w:rPr>
-              <w:t>ES</w:t>
+              <w:t>}}</w:t>
             </w:r>
           </w:p>
         </w:tc>
@@ -917,25 +848,7 @@
                 <w:sz w:val="18"/>
                 <w:szCs w:val="18"/>
               </w:rPr>
-              <w:t>{{</w:t>
-            </w:r>
-            <w:proofErr w:type="spellStart"/>
-            <w:r>
-              <w:rPr>
-                <w:color w:val="11437E"/>
-                <w:sz w:val="18"/>
-                <w:szCs w:val="18"/>
-              </w:rPr>
-              <w:t>diameter</w:t>
-            </w:r>
-            <w:proofErr w:type="spellEnd"/>
-            <w:r>
-              <w:rPr>
-                <w:color w:val="11437E"/>
-                <w:sz w:val="18"/>
-                <w:szCs w:val="18"/>
-              </w:rPr>
-              <w:t>}}</w:t>
+              <w:t>{{diameter}}</w:t>
             </w:r>
           </w:p>
         </w:tc>
@@ -955,25 +868,7 @@
                 <w:sz w:val="18"/>
                 <w:szCs w:val="18"/>
               </w:rPr>
-              <w:t>{{</w:t>
-            </w:r>
-            <w:proofErr w:type="spellStart"/>
-            <w:r>
-              <w:rPr>
-                <w:color w:val="11437E"/>
-                <w:sz w:val="18"/>
-                <w:szCs w:val="18"/>
-              </w:rPr>
-              <w:t>length</w:t>
-            </w:r>
-            <w:proofErr w:type="spellEnd"/>
-            <w:r>
-              <w:rPr>
-                <w:color w:val="11437E"/>
-                <w:sz w:val="18"/>
-                <w:szCs w:val="18"/>
-              </w:rPr>
-              <w:t>}}</w:t>
+              <w:t>{{length}}</w:t>
             </w:r>
           </w:p>
         </w:tc>
@@ -1134,25 +1029,7 @@
                 <w:sz w:val="18"/>
                 <w:szCs w:val="18"/>
               </w:rPr>
-              <w:t>{{</w:t>
-            </w:r>
-            <w:proofErr w:type="spellStart"/>
-            <w:r>
-              <w:rPr>
-                <w:color w:val="11437E"/>
-                <w:sz w:val="18"/>
-                <w:szCs w:val="18"/>
-              </w:rPr>
-              <w:t>collaboratorname</w:t>
-            </w:r>
-            <w:proofErr w:type="spellEnd"/>
-            <w:r>
-              <w:rPr>
-                <w:color w:val="11437E"/>
-                <w:sz w:val="18"/>
-                <w:szCs w:val="18"/>
-              </w:rPr>
-              <w:t>}}</w:t>
+              <w:t>{{collaboratorname}}</w:t>
             </w:r>
           </w:p>
         </w:tc>
@@ -1178,25 +1055,7 @@
                 <w:sz w:val="18"/>
                 <w:szCs w:val="18"/>
               </w:rPr>
-              <w:t>{{</w:t>
-            </w:r>
-            <w:proofErr w:type="spellStart"/>
-            <w:r>
-              <w:rPr>
-                <w:color w:val="11437E"/>
-                <w:sz w:val="18"/>
-                <w:szCs w:val="18"/>
-              </w:rPr>
-              <w:t>collaboratorposition</w:t>
-            </w:r>
-            <w:proofErr w:type="spellEnd"/>
-            <w:r>
-              <w:rPr>
-                <w:color w:val="11437E"/>
-                <w:sz w:val="18"/>
-                <w:szCs w:val="18"/>
-              </w:rPr>
-              <w:t>}}</w:t>
+              <w:t>{{collaboratorposition}}</w:t>
             </w:r>
           </w:p>
         </w:tc>
@@ -1417,25 +1276,7 @@
                 <w:sz w:val="18"/>
                 <w:szCs w:val="18"/>
               </w:rPr>
-              <w:t>{{</w:t>
-            </w:r>
-            <w:proofErr w:type="spellStart"/>
-            <w:r>
-              <w:rPr>
-                <w:color w:val="11437E"/>
-                <w:sz w:val="18"/>
-                <w:szCs w:val="18"/>
-              </w:rPr>
-              <w:t>manometerscale</w:t>
-            </w:r>
-            <w:proofErr w:type="spellEnd"/>
-            <w:r>
-              <w:rPr>
-                <w:color w:val="11437E"/>
-                <w:sz w:val="18"/>
-                <w:szCs w:val="18"/>
-              </w:rPr>
-              <w:t>}}</w:t>
+              <w:t>{{manometerscale}}</w:t>
             </w:r>
           </w:p>
         </w:tc>
@@ -1462,25 +1303,7 @@
                 <w:sz w:val="18"/>
                 <w:szCs w:val="18"/>
               </w:rPr>
-              <w:t>{{</w:t>
-            </w:r>
-            <w:proofErr w:type="spellStart"/>
-            <w:r>
-              <w:rPr>
-                <w:color w:val="11437E"/>
-                <w:sz w:val="18"/>
-                <w:szCs w:val="18"/>
-              </w:rPr>
-              <w:t>manometercert</w:t>
-            </w:r>
-            <w:proofErr w:type="spellEnd"/>
-            <w:r>
-              <w:rPr>
-                <w:color w:val="11437E"/>
-                <w:sz w:val="18"/>
-                <w:szCs w:val="18"/>
-              </w:rPr>
-              <w:t>}}</w:t>
+              <w:t>{{manometercert}}</w:t>
             </w:r>
           </w:p>
         </w:tc>
@@ -1507,25 +1330,7 @@
                 <w:sz w:val="18"/>
                 <w:szCs w:val="18"/>
               </w:rPr>
-              <w:t>{{</w:t>
-            </w:r>
-            <w:proofErr w:type="spellStart"/>
-            <w:r>
-              <w:rPr>
-                <w:color w:val="11437E"/>
-                <w:sz w:val="18"/>
-                <w:szCs w:val="18"/>
-              </w:rPr>
-              <w:t>manometercalibration</w:t>
-            </w:r>
-            <w:proofErr w:type="spellEnd"/>
-            <w:r>
-              <w:rPr>
-                <w:color w:val="11437E"/>
-                <w:sz w:val="18"/>
-                <w:szCs w:val="18"/>
-              </w:rPr>
-              <w:t>}}</w:t>
+              <w:t>{{manometercalibration}}</w:t>
             </w:r>
           </w:p>
         </w:tc>
@@ -1552,25 +1357,7 @@
                 <w:sz w:val="18"/>
                 <w:szCs w:val="18"/>
               </w:rPr>
-              <w:t>{{</w:t>
-            </w:r>
-            <w:proofErr w:type="spellStart"/>
-            <w:r>
-              <w:rPr>
-                <w:color w:val="11437E"/>
-                <w:sz w:val="18"/>
-                <w:szCs w:val="18"/>
-              </w:rPr>
-              <w:t>manometerexpiring</w:t>
-            </w:r>
-            <w:proofErr w:type="spellEnd"/>
-            <w:r>
-              <w:rPr>
-                <w:color w:val="11437E"/>
-                <w:sz w:val="18"/>
-                <w:szCs w:val="18"/>
-              </w:rPr>
-              <w:t>}}</w:t>
+              <w:t>{{manometerexpiring}}</w:t>
             </w:r>
           </w:p>
         </w:tc>
@@ -1686,7 +1473,6 @@
               </w:rPr>
               <w:t>{{</w:t>
             </w:r>
-            <w:proofErr w:type="spellStart"/>
             <w:r>
               <w:rPr>
                 <w:color w:val="11437E"/>
@@ -1695,7 +1481,6 @@
               </w:rPr>
               <w:t>manometerphotos</w:t>
             </w:r>
-            <w:proofErr w:type="spellEnd"/>
             <w:r>
               <w:rPr>
                 <w:color w:val="11437E"/>
@@ -1908,25 +1693,7 @@
                 <w:sz w:val="18"/>
                 <w:szCs w:val="18"/>
               </w:rPr>
-              <w:t>{{</w:t>
-            </w:r>
-            <w:proofErr w:type="spellStart"/>
-            <w:r>
-              <w:rPr>
-                <w:color w:val="11437E"/>
-                <w:sz w:val="18"/>
-                <w:szCs w:val="18"/>
-              </w:rPr>
-              <w:t>systemphotos</w:t>
-            </w:r>
-            <w:proofErr w:type="spellEnd"/>
-            <w:r>
-              <w:rPr>
-                <w:color w:val="11437E"/>
-                <w:sz w:val="18"/>
-                <w:szCs w:val="18"/>
-              </w:rPr>
-              <w:t>}}</w:t>
+              <w:t>{{systemphotos}}</w:t>
             </w:r>
           </w:p>
         </w:tc>
@@ -2054,15 +1821,7 @@
                 <w:sz w:val="20"/>
                 <w:szCs w:val="20"/>
               </w:rPr>
-              <w:t>N</w:t>
-            </w:r>
-            <w:r>
-              <w:rPr>
-                <w:color w:val="000000" w:themeColor="text1"/>
-                <w:sz w:val="20"/>
-                <w:szCs w:val="20"/>
-              </w:rPr>
-              <w:t>ão apresentar vazamentos durante o teste;</w:t>
+              <w:t>Não apresentar vazamentos durante o teste;</w:t>
             </w:r>
           </w:p>
           <w:p>
@@ -2086,15 +1845,7 @@
                 <w:sz w:val="20"/>
                 <w:szCs w:val="20"/>
               </w:rPr>
-              <w:t>A</w:t>
-            </w:r>
-            <w:r>
-              <w:rPr>
-                <w:color w:val="000000" w:themeColor="text1"/>
-                <w:sz w:val="20"/>
-                <w:szCs w:val="20"/>
-              </w:rPr>
-              <w:t xml:space="preserve"> pressão de teste for aplicada conforme critério de projeto ou, na ausência de definição específica, até </w:t>
+              <w:t xml:space="preserve">A pressão de teste for aplicada conforme critério de projeto ou, na ausência de definição específica, até </w:t>
             </w:r>
             <w:r>
               <w:rPr>
@@ -2134,15 +1885,7 @@
                 <w:sz w:val="20"/>
                 <w:szCs w:val="20"/>
               </w:rPr>
-              <w:t>A</w:t>
-            </w:r>
-            <w:r>
-              <w:rPr>
-                <w:color w:val="000000" w:themeColor="text1"/>
-                <w:sz w:val="20"/>
-                <w:szCs w:val="20"/>
-              </w:rPr>
-              <w:t xml:space="preserve"> pressão for mantida pelo tempo exigido — mínimo de 1 hora para inspeção, salvo especificação diferente, e de 30 a 60 minutos após estabilização quando aplicável;</w:t>
+              <w:t>A pressão for mantida pelo tempo exigido — mínimo de 1 hora para inspeção, salvo especificação diferente, e de 30 a 60 minutos após estabilização quando aplicável;</w:t>
             </w:r>
           </w:p>
           <w:p>
@@ -2166,15 +1909,7 @@
                 <w:sz w:val="20"/>
                 <w:szCs w:val="20"/>
               </w:rPr>
-              <w:t>N</w:t>
-            </w:r>
-            <w:r>
-              <w:rPr>
-                <w:color w:val="000000" w:themeColor="text1"/>
-                <w:sz w:val="20"/>
-                <w:szCs w:val="20"/>
-              </w:rPr>
-              <w:t>ão houver queda de pressão indicativa de vazamento;</w:t>
+              <w:t>Não houver queda de pressão indicativa de vazamento;</w:t>
             </w:r>
           </w:p>
           <w:p>
@@ -2198,15 +1933,7 @@
                 <w:sz w:val="20"/>
                 <w:szCs w:val="20"/>
               </w:rPr>
-              <w:t>A</w:t>
-            </w:r>
-            <w:r>
-              <w:rPr>
-                <w:color w:val="000000" w:themeColor="text1"/>
-                <w:sz w:val="20"/>
-                <w:szCs w:val="20"/>
-              </w:rPr>
-              <w:t>s soldas e áreas adjacentes forem inspecionadas visualmente;</w:t>
+              <w:t>As soldas e áreas adjacentes forem inspecionadas visualmente;</w:t>
             </w:r>
           </w:p>
           <w:p>
@@ -2230,15 +1957,7 @@
                 <w:sz w:val="20"/>
                 <w:szCs w:val="20"/>
               </w:rPr>
-              <w:t>O</w:t>
-            </w:r>
-            <w:r>
-              <w:rPr>
-                <w:color w:val="000000" w:themeColor="text1"/>
-                <w:sz w:val="20"/>
-                <w:szCs w:val="20"/>
-              </w:rPr>
-              <w:t>s manômetros estiverem calibrados e posicionados conforme procedimento</w:t>
+              <w:t>Os manômetros estiverem calibrados e posicionados conforme procedimento</w:t>
             </w:r>
           </w:p>
         </w:tc>
@@ -2333,25 +2052,7 @@
                 <w:sz w:val="18"/>
                 <w:szCs w:val="18"/>
               </w:rPr>
-              <w:t>{{</w:t>
-            </w:r>
-            <w:proofErr w:type="spellStart"/>
-            <w:r>
-              <w:rPr>
-                <w:color w:val="11437E"/>
-                <w:sz w:val="18"/>
-                <w:szCs w:val="18"/>
-              </w:rPr>
-              <w:t>obs</w:t>
-            </w:r>
-            <w:proofErr w:type="spellEnd"/>
-            <w:r>
-              <w:rPr>
-                <w:color w:val="11437E"/>
-                <w:sz w:val="18"/>
-                <w:szCs w:val="18"/>
-              </w:rPr>
-              <w:t>}}</w:t>
+              <w:t>{{obs}}</w:t>
             </w:r>
           </w:p>
         </w:tc>
@@ -2457,21 +2158,7 @@
               <w:rPr>
                 <w:color w:val="11437E"/>
               </w:rPr>
-              <w:t xml:space="preserve"> {{</w:t>
-            </w:r>
-            <w:proofErr w:type="spellStart"/>
-            <w:r>
-              <w:rPr>
-                <w:color w:val="11437E"/>
-              </w:rPr>
-              <w:t>leadername</w:t>
-            </w:r>
-            <w:proofErr w:type="spellEnd"/>
-            <w:r>
-              <w:rPr>
-                <w:color w:val="11437E"/>
-              </w:rPr>
-              <w:t>}}</w:t>
+              <w:t xml:space="preserve"> {{leadername}}</w:t>
             </w:r>
           </w:p>
           <w:p>
@@ -2493,21 +2180,7 @@
               <w:rPr>
                 <w:color w:val="11437E"/>
               </w:rPr>
-              <w:t>{{</w:t>
-            </w:r>
-            <w:proofErr w:type="spellStart"/>
-            <w:r>
-              <w:rPr>
-                <w:color w:val="11437E"/>
-              </w:rPr>
-              <w:t>leaderposition</w:t>
-            </w:r>
-            <w:proofErr w:type="spellEnd"/>
-            <w:r>
-              <w:rPr>
-                <w:color w:val="11437E"/>
-              </w:rPr>
-              <w:t>}}</w:t>
+              <w:t>{{leaderposition}}</w:t>
             </w:r>
           </w:p>
         </w:tc>
@@ -3176,7 +2849,6 @@
             </w:rPr>
             <w:t>{{</w:t>
           </w:r>
-          <w:proofErr w:type="spellStart"/>
           <w:r>
             <w:rPr>
               <w:b/>
@@ -3185,7 +2857,6 @@
             </w:rPr>
             <w:t>missiontitle</w:t>
           </w:r>
-          <w:proofErr w:type="spellEnd"/>
           <w:r>
             <w:rPr>
               <w:b/>
@@ -3229,29 +2900,7 @@
               <w:sz w:val="18"/>
               <w:szCs w:val="18"/>
             </w:rPr>
-            <w:t>{{</w:t>
-          </w:r>
-          <w:proofErr w:type="spellStart"/>
-          <w:r>
-            <w:rPr>
-              <w:b/>
-              <w:bCs/>
-              <w:color w:val="11437E"/>
-              <w:sz w:val="18"/>
-              <w:szCs w:val="18"/>
-            </w:rPr>
-            <w:t>client</w:t>
-          </w:r>
-          <w:proofErr w:type="spellEnd"/>
-          <w:r>
-            <w:rPr>
-              <w:b/>
-              <w:bCs/>
-              <w:color w:val="11437E"/>
-              <w:sz w:val="18"/>
-              <w:szCs w:val="18"/>
-            </w:rPr>
-            <w:t>}}</w:t>
+            <w:t>{{client}}</w:t>
           </w:r>
         </w:p>
       </w:tc>
@@ -3279,29 +2928,7 @@
               <w:sz w:val="18"/>
               <w:szCs w:val="18"/>
             </w:rPr>
-            <w:t>{{</w:t>
-          </w:r>
-          <w:proofErr w:type="spellStart"/>
-          <w:r>
-            <w:rPr>
-              <w:b/>
-              <w:bCs/>
-              <w:color w:val="11437E"/>
-              <w:sz w:val="18"/>
-              <w:szCs w:val="18"/>
-            </w:rPr>
-            <w:t>proposal</w:t>
-          </w:r>
-          <w:proofErr w:type="spellEnd"/>
-          <w:r>
-            <w:rPr>
-              <w:b/>
-              <w:bCs/>
-              <w:color w:val="11437E"/>
-              <w:sz w:val="18"/>
-              <w:szCs w:val="18"/>
-            </w:rPr>
-            <w:t>}}</w:t>
+            <w:t>{{proposal}}</w:t>
           </w:r>
         </w:p>
       </w:tc>
@@ -3347,18 +2974,7 @@
               <w:sz w:val="18"/>
               <w:szCs w:val="18"/>
             </w:rPr>
-            <w:t>{{</w:t>
-          </w:r>
-          <w:proofErr w:type="spellStart"/>
-          <w:r>
-            <w:rPr>
-              <w:b/>
-              <w:bCs/>
-              <w:color w:val="11437E"/>
-              <w:sz w:val="18"/>
-              <w:szCs w:val="18"/>
-            </w:rPr>
-            <w:t>r</w:t>
+            <w:t>{{r</w:t>
           </w:r>
           <w:r>
             <w:rPr>
@@ -3370,7 +2986,6 @@
             </w:rPr>
             <w:t>tp</w:t>
           </w:r>
-          <w:proofErr w:type="spellEnd"/>
           <w:r>
             <w:rPr>
               <w:b/>
@@ -3413,29 +3028,7 @@
               <w:sz w:val="18"/>
               <w:szCs w:val="18"/>
             </w:rPr>
-            <w:t xml:space="preserve"> {{</w:t>
-          </w:r>
-          <w:proofErr w:type="spellStart"/>
-          <w:r>
-            <w:rPr>
-              <w:b/>
-              <w:bCs/>
-              <w:color w:val="11437E"/>
-              <w:sz w:val="18"/>
-              <w:szCs w:val="18"/>
-            </w:rPr>
-            <w:t>cnpj</w:t>
-          </w:r>
-          <w:proofErr w:type="spellEnd"/>
-          <w:r>
-            <w:rPr>
-              <w:b/>
-              <w:bCs/>
-              <w:color w:val="11437E"/>
-              <w:sz w:val="18"/>
-              <w:szCs w:val="18"/>
-            </w:rPr>
-            <w:t>}}</w:t>
+            <w:t xml:space="preserve"> {{cnpj}}</w:t>
           </w:r>
         </w:p>
       </w:tc>
@@ -4241,6 +3834,7 @@
   <w:style w:type="character" w:default="1" w:styleId="Fontepargpadro">
     <w:name w:val="Default Paragraph Font"/>
     <w:uiPriority w:val="1"/>
+    <w:semiHidden/>
     <w:unhideWhenUsed/>
   </w:style>
   <w:style w:type="table" w:default="1" w:styleId="Tabelanormal">

</xml_diff>